<commit_message>
Feat: sustitucion de boton Parametros por controles directos de Box, Unidad, Barra y Tema en cabecera
</commit_message>
<xml_diff>
--- a/Prompt solicitud Halterofilia Pro.docx
+++ b/Prompt solicitud Halterofilia Pro.docx
@@ -15,6 +15,7 @@
           <w:lang w:val="es-VE"/>
         </w:rPr>
       </w:pPr>
+      <w:bookmarkStart w:id="0" w:name="_GoBack"/>
       <w:r>
         <w:rPr>
           <w:lang w:val="es-VE"/>
@@ -316,26 +317,15 @@
           <w:bCs/>
           <w:lang w:val="en-US"/>
         </w:rPr>
-        <w:t>Glob</w:t>
-      </w:r>
-      <w:bookmarkStart w:id="0" w:name="_GoBack"/>
-      <w:bookmarkEnd w:id="0"/>
-      <w:r>
-        <w:rPr>
-          <w:rStyle w:val="CdigoHTML"/>
+        <w:t>Globals</w:t>
+      </w:r>
+      <w:proofErr w:type="spellEnd"/>
+      <w:r>
+        <w:rPr>
           <w:b/>
           <w:bCs/>
           <w:lang w:val="en-US"/>
         </w:rPr>
-        <w:t>als</w:t>
-      </w:r>
-      <w:proofErr w:type="spellEnd"/>
-      <w:r>
-        <w:rPr>
-          <w:b/>
-          <w:bCs/>
-          <w:lang w:val="en-US"/>
-        </w:rPr>
         <w:t>:</w:t>
       </w:r>
       <w:r>
@@ -420,6 +410,12 @@
         </w:rPr>
         <w:t>V3</w:t>
       </w:r>
+      <w:r>
+        <w:rPr>
+          <w:rStyle w:val="CdigoHTML"/>
+        </w:rPr>
+        <w:t>.26</w:t>
+      </w:r>
       <w:proofErr w:type="gramStart"/>
       <w:r>
         <w:rPr>
@@ -432,12 +428,25 @@
         <w:rPr>
           <w:rStyle w:val="CdigoHTML"/>
         </w:rPr>
-        <w:t>año del sistema&gt; .&lt;mes sistema&gt;</w:t>
+        <w:t>consecutivo&gt;</w:t>
       </w:r>
     </w:p>
     <w:p/>
-    <w:p/>
-    <w:p/>
+    <w:bookmarkEnd w:id="0"/>
+    <w:p>
+      <w:pPr>
+        <w:rPr>
+          <w:lang w:val="en-US"/>
+        </w:rPr>
+      </w:pPr>
+    </w:p>
+    <w:p>
+      <w:pPr>
+        <w:rPr>
+          <w:lang w:val="en-US"/>
+        </w:rPr>
+      </w:pPr>
+    </w:p>
     <w:sectPr>
       <w:pgSz w:w="12240" w:h="15840"/>
       <w:pgMar w:top="1417" w:right="1701" w:bottom="1417" w:left="1701" w:header="720" w:footer="720" w:gutter="0"/>

</xml_diff>